<commit_message>
Add case study on Grace Hopper and the evolution of compilers and AI-generated code
This commit introduces a new case study titled "Grace Hopper, Compilers and the Abstraction Bargain," exploring the historical context of compilers, the impact of abstraction in programming, and the implications of AI-generated code. The study discusses Hopper's contributions, the evolution of programming languages, and the ongoing debate about abstraction in software development. It includes detailed examples, arguments from key figures, and discussion questions for further exploration.
</commit_message>
<xml_diff>
--- a/docs/summer_2026/cases/index.docx
+++ b/docs/summer_2026/cases/index.docx
@@ -216,9 +216,14 @@
             <w:pPr>
               <w:pStyle w:val="Compact"/>
             </w:pPr>
-            <w:r>
-              <w:t xml:space="preserve">Grace Hopper, Compilers &amp; the Abstraction Bargain</w:t>
-            </w:r>
+            <w:hyperlink r:id="rId11">
+              <w:r>
+                <w:rPr>
+                  <w:rStyle w:val="Hyperlink"/>
+                </w:rPr>
+                <w:t xml:space="preserve">Grace Hopper, Compilers &amp; the Abstraction Bargain</w:t>
+              </w:r>
+            </w:hyperlink>
           </w:p>
         </w:tc>
         <w:tc>
@@ -229,10 +234,10 @@
             </w:pPr>
             <w:r>
               <w:rPr>
-                <w:i/>
-                <w:iCs/>
+                <w:b/>
+                <w:bCs/>
               </w:rPr>
-              <w:t xml:space="preserve">In progress</w:t>
+              <w:t xml:space="preserve">Available</w:t>
             </w:r>
           </w:p>
         </w:tc>
@@ -255,7 +260,7 @@
             <w:pPr>
               <w:pStyle w:val="Compact"/>
             </w:pPr>
-            <w:hyperlink r:id="rId11">
+            <w:hyperlink r:id="rId12">
               <w:r>
                 <w:rPr>
                   <w:rStyle w:val="Hyperlink"/>
@@ -594,7 +599,7 @@
         </w:tc>
       </w:tr>
     </w:tbl>
-    <w:bookmarkStart w:id="12" w:name="how-to-read-these"/>
+    <w:bookmarkStart w:id="13" w:name="how-to-read-these"/>
     <w:p>
       <w:pPr>
         <w:pStyle w:val="Heading2"/>
@@ -725,7 +730,7 @@
         <w:t xml:space="preserve">about with other people — not for looking up.</w:t>
       </w:r>
     </w:p>
-    <w:bookmarkEnd w:id="12"/>
+    <w:bookmarkEnd w:id="13"/>
     <w:sectPr>
       <w:footnotePr>
         <w:numRestart w:val="eachSect"/>

</xml_diff>